<commit_message>
feat: add deterministic proposal generation and visual QA
</commit_message>
<xml_diff>
--- a/template/Tassure_Proposal_CNEN.docx
+++ b/template/Tassure_Proposal_CNEN.docx
@@ -5393,6 +5393,7 @@
             <w:shd w:val="clear" w:color="auto" w:fill="BFBFBF" w:themeFill="background1" w:themeFillShade="BF"/>
           </w:tcPr>
           <w:p>
+            <w:bookmarkStart w:id="1" w:name="TASSURE_TABLE_MAIN"/>
             <w:pPr>
               <w:jc w:val="center"/>
               <w:rPr>
@@ -5409,6 +5410,7 @@
               </w:rPr>
               <w:t>No.</w:t>
             </w:r>
+            <w:bookmarkEnd w:id="1"/>
           </w:p>
           <w:p>
             <w:pPr>
@@ -5560,6 +5562,7 @@
             <w:tcW w:w="530" w:type="dxa"/>
           </w:tcPr>
           <w:p>
+            <w:bookmarkStart w:id="2" w:name="TASSURE_ROW_MAIN_INCORP"/>
             <w:pPr>
               <w:jc w:val="center"/>
               <w:rPr>
@@ -5578,6 +5581,7 @@
               </w:rPr>
               <w:t>1</w:t>
             </w:r>
+            <w:bookmarkEnd w:id="2"/>
           </w:p>
         </w:tc>
         <w:tc>
@@ -5671,6 +5675,7 @@
             <w:tcW w:w="530" w:type="dxa"/>
           </w:tcPr>
           <w:p>
+            <w:bookmarkStart w:id="3" w:name="TASSURE_ROW_MAIN_SEC"/>
             <w:pPr>
               <w:jc w:val="center"/>
               <w:rPr>
@@ -5689,6 +5694,7 @@
               </w:rPr>
               <w:t>2</w:t>
             </w:r>
+            <w:bookmarkEnd w:id="3"/>
           </w:p>
         </w:tc>
         <w:tc>
@@ -5818,6 +5824,7 @@
             <w:tcW w:w="530" w:type="dxa"/>
           </w:tcPr>
           <w:p>
+            <w:bookmarkStart w:id="4" w:name="TASSURE_ROW_MAIN_BANK"/>
             <w:pPr>
               <w:jc w:val="center"/>
               <w:rPr>
@@ -5836,6 +5843,7 @@
               </w:rPr>
               <w:t>3</w:t>
             </w:r>
+            <w:bookmarkEnd w:id="4"/>
           </w:p>
         </w:tc>
         <w:tc>
@@ -5933,6 +5941,7 @@
             <w:tcW w:w="530" w:type="dxa"/>
           </w:tcPr>
           <w:p>
+            <w:bookmarkStart w:id="5" w:name="TASSURE_ROW_MAIN_ADDR"/>
             <w:pPr>
               <w:jc w:val="center"/>
               <w:rPr>
@@ -5951,6 +5960,7 @@
               </w:rPr>
               <w:t>4</w:t>
             </w:r>
+            <w:bookmarkEnd w:id="5"/>
           </w:p>
         </w:tc>
         <w:tc>
@@ -6082,6 +6092,7 @@
             <w:vMerge w:val="restart"/>
           </w:tcPr>
           <w:p>
+            <w:bookmarkStart w:id="6" w:name="TASSURE_ROW_MAIN_ND"/>
             <w:pPr>
               <w:jc w:val="center"/>
               <w:rPr>
@@ -6091,6 +6102,7 @@
                 <w:lang w:eastAsia="zh-CN"/>
               </w:rPr>
             </w:pPr>
+            <w:bookmarkEnd w:id="6"/>
           </w:p>
           <w:p>
             <w:pPr>
@@ -6236,6 +6248,7 @@
             <w:vMerge/>
           </w:tcPr>
           <w:p>
+            <w:bookmarkStart w:id="7" w:name="TASSURE_ROW_MAIN_ND_DEPOSIT"/>
             <w:pPr>
               <w:jc w:val="center"/>
               <w:rPr>
@@ -6245,6 +6258,7 @@
                 <w:lang w:eastAsia="zh-CN"/>
               </w:rPr>
             </w:pPr>
+            <w:bookmarkEnd w:id="7"/>
           </w:p>
         </w:tc>
         <w:tc>
@@ -6329,6 +6343,7 @@
             <w:tcW w:w="530" w:type="dxa"/>
           </w:tcPr>
           <w:p>
+            <w:bookmarkStart w:id="8" w:name="TASSURE_ROW_MAIN_EP"/>
             <w:pPr>
               <w:jc w:val="center"/>
               <w:rPr>
@@ -6347,6 +6362,7 @@
               </w:rPr>
               <w:t>6</w:t>
             </w:r>
+            <w:bookmarkEnd w:id="8"/>
           </w:p>
         </w:tc>
         <w:tc>
@@ -6441,6 +6457,7 @@
             <w:tcW w:w="530" w:type="dxa"/>
           </w:tcPr>
           <w:p>
+            <w:bookmarkStart w:id="9" w:name="TASSURE_ROW_MAIN_POST_EP"/>
             <w:pPr>
               <w:jc w:val="center"/>
               <w:rPr>
@@ -6459,6 +6476,7 @@
               </w:rPr>
               <w:t>7</w:t>
             </w:r>
+            <w:bookmarkEnd w:id="9"/>
           </w:p>
         </w:tc>
         <w:tc>
@@ -6710,6 +6728,7 @@
             <w:tcW w:w="530" w:type="dxa"/>
           </w:tcPr>
           <w:p>
+            <w:bookmarkStart w:id="10" w:name="TASSURE_ROW_MAIN_CORPPASS"/>
             <w:pPr>
               <w:jc w:val="center"/>
               <w:rPr>
@@ -6728,6 +6747,7 @@
               </w:rPr>
               <w:t>8</w:t>
             </w:r>
+            <w:bookmarkEnd w:id="10"/>
           </w:p>
         </w:tc>
         <w:tc>
@@ -6893,6 +6913,7 @@
             <w:tcW w:w="530" w:type="dxa"/>
           </w:tcPr>
           <w:p>
+            <w:bookmarkStart w:id="11" w:name="TASSURE_ROW_MAIN_PDPA"/>
             <w:pPr>
               <w:jc w:val="center"/>
               <w:rPr>
@@ -6911,6 +6932,7 @@
               </w:rPr>
               <w:t>9</w:t>
             </w:r>
+            <w:bookmarkEnd w:id="11"/>
           </w:p>
         </w:tc>
         <w:tc>
@@ -7109,6 +7131,7 @@
             <w:tcW w:w="530" w:type="dxa"/>
           </w:tcPr>
           <w:p>
+            <w:bookmarkStart w:id="12" w:name="TASSURE_ROW_MAIN_CORP_CONSULT"/>
             <w:pPr>
               <w:jc w:val="center"/>
               <w:rPr>
@@ -7127,6 +7150,7 @@
               </w:rPr>
               <w:t>10</w:t>
             </w:r>
+            <w:bookmarkEnd w:id="12"/>
           </w:p>
         </w:tc>
         <w:tc>
@@ -7285,6 +7309,7 @@
             <w:tcW w:w="530" w:type="dxa"/>
           </w:tcPr>
           <w:p>
+            <w:bookmarkStart w:id="13" w:name="TASSURE_ROW_MAIN_CERT"/>
             <w:pPr>
               <w:jc w:val="center"/>
             </w:pPr>
@@ -7295,6 +7320,7 @@
               </w:rPr>
               <w:t>11</w:t>
             </w:r>
+            <w:bookmarkEnd w:id="13"/>
           </w:p>
         </w:tc>
         <w:tc>
@@ -7354,6 +7380,7 @@
             <w:tcW w:w="530" w:type="dxa"/>
           </w:tcPr>
           <w:p>
+            <w:bookmarkStart w:id="14" w:name="TASSURE_ROW_MAIN_DP_MAIN"/>
             <w:pPr>
               <w:jc w:val="center"/>
             </w:pPr>
@@ -7365,6 +7392,7 @@
               <w:lastRenderedPageBreak/>
               <w:t>12</w:t>
             </w:r>
+            <w:bookmarkEnd w:id="14"/>
           </w:p>
         </w:tc>
         <w:tc>
@@ -7432,6 +7460,7 @@
             <w:tcW w:w="530" w:type="dxa"/>
           </w:tcPr>
           <w:p>
+            <w:bookmarkStart w:id="15" w:name="TASSURE_ROW_MAIN_LOC_MAIN"/>
             <w:pPr>
               <w:jc w:val="center"/>
             </w:pPr>
@@ -7442,6 +7471,7 @@
               </w:rPr>
               <w:t>13</w:t>
             </w:r>
+            <w:bookmarkEnd w:id="15"/>
           </w:p>
         </w:tc>
         <w:tc>
@@ -7782,6 +7812,7 @@
             <w:shd w:val="clear" w:color="auto" w:fill="BFBFBF" w:themeFill="background1" w:themeFillShade="BF"/>
           </w:tcPr>
           <w:p>
+            <w:bookmarkStart w:id="16" w:name="TASSURE_TABLE_OPT"/>
             <w:pPr>
               <w:jc w:val="center"/>
               <w:rPr>
@@ -7798,6 +7829,7 @@
               </w:rPr>
               <w:t>No.</w:t>
             </w:r>
+            <w:bookmarkEnd w:id="16"/>
           </w:p>
           <w:p>
             <w:pPr>
@@ -7983,6 +8015,7 @@
             <w:tcW w:w="530" w:type="dxa"/>
           </w:tcPr>
           <w:p>
+            <w:bookmarkStart w:id="17" w:name="TASSURE_ROW_OPT_ACCOUNTS"/>
             <w:pPr>
               <w:jc w:val="center"/>
               <w:rPr>
@@ -8001,6 +8034,7 @@
               </w:rPr>
               <w:t>1</w:t>
             </w:r>
+            <w:bookmarkEnd w:id="17"/>
           </w:p>
         </w:tc>
         <w:tc>
@@ -8169,6 +8203,7 @@
             <w:tcW w:w="530" w:type="dxa"/>
           </w:tcPr>
           <w:p>
+            <w:bookmarkStart w:id="18" w:name="TASSURE_ROW_OPT_SECRETARIAL"/>
             <w:pPr>
               <w:jc w:val="center"/>
               <w:rPr>
@@ -8187,6 +8222,7 @@
               </w:rPr>
               <w:t>2</w:t>
             </w:r>
+            <w:bookmarkEnd w:id="18"/>
           </w:p>
         </w:tc>
         <w:tc>
@@ -8305,6 +8341,7 @@
             <w:vMerge w:val="restart"/>
           </w:tcPr>
           <w:p>
+            <w:bookmarkStart w:id="19" w:name="TASSURE_ROW_OPT_ND"/>
             <w:pPr>
               <w:jc w:val="center"/>
               <w:rPr>
@@ -8314,6 +8351,7 @@
                 <w:lang w:eastAsia="zh-CN"/>
               </w:rPr>
             </w:pPr>
+            <w:bookmarkEnd w:id="19"/>
           </w:p>
           <w:p>
             <w:pPr>
@@ -8456,6 +8494,7 @@
             <w:vMerge/>
           </w:tcPr>
           <w:p>
+            <w:bookmarkStart w:id="20" w:name="TASSURE_ROW_OPT_ND_DEPOSIT"/>
             <w:pPr>
               <w:jc w:val="center"/>
               <w:rPr>
@@ -8465,6 +8504,7 @@
                 <w:lang w:eastAsia="zh-CN"/>
               </w:rPr>
             </w:pPr>
+            <w:bookmarkEnd w:id="20"/>
           </w:p>
         </w:tc>
         <w:tc>
@@ -8549,6 +8589,7 @@
             <w:tcW w:w="530" w:type="dxa"/>
           </w:tcPr>
           <w:p>
+            <w:bookmarkStart w:id="21" w:name="TASSURE_ROW_OPT_ADDRESS"/>
             <w:pPr>
               <w:jc w:val="center"/>
               <w:rPr>
@@ -8567,6 +8608,7 @@
               </w:rPr>
               <w:t>4</w:t>
             </w:r>
+            <w:bookmarkEnd w:id="21"/>
           </w:p>
         </w:tc>
         <w:tc>
@@ -8700,6 +8742,7 @@
             <w:tcW w:w="530" w:type="dxa"/>
           </w:tcPr>
           <w:p>
+            <w:bookmarkStart w:id="22" w:name="TASSURE_ROW_OPT_AR_GOV"/>
             <w:pPr>
               <w:jc w:val="center"/>
               <w:rPr>
@@ -8718,6 +8761,7 @@
               </w:rPr>
               <w:t>5</w:t>
             </w:r>
+            <w:bookmarkEnd w:id="22"/>
           </w:p>
         </w:tc>
         <w:tc>
@@ -8809,6 +8853,7 @@
             <w:tcW w:w="530" w:type="dxa"/>
           </w:tcPr>
           <w:p>
+            <w:bookmarkStart w:id="23" w:name="TASSURE_ROW_OPT_UFS"/>
             <w:pPr>
               <w:jc w:val="center"/>
               <w:rPr>
@@ -8827,6 +8872,7 @@
               </w:rPr>
               <w:t>6</w:t>
             </w:r>
+            <w:bookmarkEnd w:id="23"/>
           </w:p>
         </w:tc>
         <w:tc>
@@ -8935,6 +8981,7 @@
             <w:tcW w:w="530" w:type="dxa"/>
           </w:tcPr>
           <w:p>
+            <w:bookmarkStart w:id="24" w:name="TASSURE_ROW_OPT_CORPTAX"/>
             <w:pPr>
               <w:jc w:val="center"/>
               <w:rPr>
@@ -8953,6 +9000,7 @@
               </w:rPr>
               <w:t>7</w:t>
             </w:r>
+            <w:bookmarkEnd w:id="24"/>
           </w:p>
         </w:tc>
         <w:tc>
@@ -9043,6 +9091,7 @@
             <w:tcW w:w="530" w:type="dxa"/>
           </w:tcPr>
           <w:p>
+            <w:bookmarkStart w:id="25" w:name="TASSURE_ROW_OPT_PERSONALTAX"/>
             <w:pPr>
               <w:jc w:val="center"/>
               <w:rPr>
@@ -9061,6 +9110,7 @@
               </w:rPr>
               <w:t>8</w:t>
             </w:r>
+            <w:bookmarkEnd w:id="25"/>
           </w:p>
         </w:tc>
         <w:tc>
@@ -9190,6 +9240,7 @@
             <w:tcW w:w="530" w:type="dxa"/>
           </w:tcPr>
           <w:p>
+            <w:bookmarkStart w:id="26" w:name="TASSURE_ROW_OPT_PAYROLL"/>
             <w:pPr>
               <w:jc w:val="center"/>
               <w:rPr>
@@ -9208,6 +9259,7 @@
               </w:rPr>
               <w:t>9</w:t>
             </w:r>
+            <w:bookmarkEnd w:id="26"/>
           </w:p>
         </w:tc>
         <w:tc>
@@ -9485,6 +9537,7 @@
             <w:tcW w:w="530" w:type="dxa"/>
           </w:tcPr>
           <w:p>
+            <w:bookmarkStart w:id="27" w:name="TASSURE_ROW_OPT_XBRL"/>
             <w:pPr>
               <w:jc w:val="center"/>
               <w:rPr>
@@ -9503,6 +9556,7 @@
               </w:rPr>
               <w:t>10</w:t>
             </w:r>
+            <w:bookmarkEnd w:id="27"/>
           </w:p>
         </w:tc>
         <w:tc>
@@ -9604,6 +9658,7 @@
             <w:tcW w:w="530" w:type="dxa"/>
           </w:tcPr>
           <w:p>
+            <w:bookmarkStart w:id="28" w:name="TASSURE_ROW_OPT_AUDIT"/>
             <w:pPr>
               <w:jc w:val="center"/>
               <w:rPr>
@@ -9631,6 +9686,7 @@
               </w:rPr>
               <w:t>1</w:t>
             </w:r>
+            <w:bookmarkEnd w:id="28"/>
           </w:p>
         </w:tc>
         <w:tc>
@@ -9716,6 +9772,7 @@
             <w:tcW w:w="530" w:type="dxa"/>
           </w:tcPr>
           <w:p>
+            <w:bookmarkStart w:id="29" w:name="TASSURE_ROW_OPT_AIS"/>
             <w:pPr>
               <w:jc w:val="center"/>
               <w:rPr>
@@ -9743,6 +9800,7 @@
               </w:rPr>
               <w:t>2</w:t>
             </w:r>
+            <w:bookmarkEnd w:id="29"/>
           </w:p>
         </w:tc>
         <w:tc>
@@ -10077,6 +10135,7 @@
             <w:shd w:val="clear" w:color="auto" w:fill="BFBFBF" w:themeFill="background1" w:themeFillShade="BF"/>
           </w:tcPr>
           <w:p>
+            <w:bookmarkStart w:id="30" w:name="TASSURE_TABLE_EP"/>
             <w:pPr>
               <w:jc w:val="center"/>
               <w:rPr>
@@ -10093,6 +10152,7 @@
               </w:rPr>
               <w:t>No.</w:t>
             </w:r>
+            <w:bookmarkEnd w:id="30"/>
           </w:p>
           <w:p>
             <w:pPr>
@@ -10266,6 +10326,7 @@
             <w:tcW w:w="530" w:type="dxa"/>
           </w:tcPr>
           <w:p>
+            <w:bookmarkStart w:id="31" w:name="TASSURE_ROW_EP_RENEW"/>
             <w:pPr>
               <w:jc w:val="center"/>
               <w:rPr>
@@ -10284,6 +10345,7 @@
               </w:rPr>
               <w:t>1</w:t>
             </w:r>
+            <w:bookmarkEnd w:id="31"/>
           </w:p>
         </w:tc>
         <w:tc>
@@ -10381,6 +10443,7 @@
             <w:tcW w:w="530" w:type="dxa"/>
           </w:tcPr>
           <w:p>
+            <w:bookmarkStart w:id="32" w:name="TASSURE_ROW_EP_DP"/>
             <w:pPr>
               <w:jc w:val="center"/>
               <w:rPr>
@@ -10399,6 +10462,7 @@
               </w:rPr>
               <w:t>2</w:t>
             </w:r>
+            <w:bookmarkEnd w:id="32"/>
           </w:p>
         </w:tc>
         <w:tc>
@@ -10505,6 +10569,7 @@
             <w:tcW w:w="530" w:type="dxa"/>
           </w:tcPr>
           <w:p>
+            <w:bookmarkStart w:id="33" w:name="TASSURE_ROW_EP_DP_RENEW"/>
             <w:pPr>
               <w:jc w:val="center"/>
             </w:pPr>
@@ -10515,6 +10580,7 @@
               </w:rPr>
               <w:t>3</w:t>
             </w:r>
+            <w:bookmarkEnd w:id="33"/>
           </w:p>
         </w:tc>
         <w:tc>
@@ -10614,6 +10680,7 @@
             <w:tcW w:w="530" w:type="dxa"/>
           </w:tcPr>
           <w:p>
+            <w:bookmarkStart w:id="34" w:name="TASSURE_ROW_EP_LOC"/>
             <w:pPr>
               <w:jc w:val="center"/>
               <w:rPr>
@@ -10632,6 +10699,7 @@
               </w:rPr>
               <w:t>4</w:t>
             </w:r>
+            <w:bookmarkEnd w:id="34"/>
           </w:p>
         </w:tc>
         <w:tc>
@@ -10720,6 +10788,7 @@
             <w:tcW w:w="530" w:type="dxa"/>
           </w:tcPr>
           <w:p>
+            <w:bookmarkStart w:id="35" w:name="TASSURE_ROW_EP_SDL"/>
             <w:pPr>
               <w:jc w:val="center"/>
               <w:rPr>
@@ -10738,6 +10807,7 @@
               </w:rPr>
               <w:t>5</w:t>
             </w:r>
+            <w:bookmarkEnd w:id="35"/>
           </w:p>
         </w:tc>
         <w:tc>
@@ -11965,6 +12035,7 @@
             </w:tcMar>
           </w:tcPr>
           <w:p>
+            <w:bookmarkStart w:id="36" w:name="TASSURE_TABLE_CHANGES"/>
             <w:pPr>
               <w:jc w:val="center"/>
               <w:rPr>
@@ -12002,6 +12073,7 @@
               </w:rPr>
               <w:t>公司秘书服务</w:t>
             </w:r>
+            <w:bookmarkEnd w:id="36"/>
           </w:p>
         </w:tc>
       </w:tr>
@@ -12320,6 +12392,7 @@
             <w:vAlign w:val="center"/>
           </w:tcPr>
           <w:p>
+            <w:bookmarkStart w:id="37" w:name="TASSURE_ROW_CC_R2"/>
             <w:pPr>
               <w:jc w:val="center"/>
             </w:pPr>
@@ -12333,6 +12406,7 @@
               </w:rPr>
               <w:t>1</w:t>
             </w:r>
+            <w:bookmarkEnd w:id="37"/>
           </w:p>
         </w:tc>
         <w:tc>
@@ -12622,7 +12696,10 @@
               <w:right w:val="single" w:sz="4" w:space="0" w:color="888888"/>
             </w:tcBorders>
           </w:tcPr>
-          <w:p/>
+          <w:p>
+            <w:bookmarkStart w:id="38" w:name="TASSURE_ROW_CC_R3"/>
+            <w:bookmarkEnd w:id="38"/>
+          </w:p>
         </w:tc>
         <w:tc>
           <w:tcPr>
@@ -12813,7 +12890,10 @@
               <w:right w:val="single" w:sz="4" w:space="0" w:color="888888"/>
             </w:tcBorders>
           </w:tcPr>
-          <w:p/>
+          <w:p>
+            <w:bookmarkStart w:id="39" w:name="TASSURE_ROW_CC_R4"/>
+            <w:bookmarkEnd w:id="39"/>
+          </w:p>
         </w:tc>
         <w:tc>
           <w:tcPr>
@@ -13004,7 +13084,10 @@
               <w:right w:val="single" w:sz="4" w:space="0" w:color="888888"/>
             </w:tcBorders>
           </w:tcPr>
-          <w:p/>
+          <w:p>
+            <w:bookmarkStart w:id="40" w:name="TASSURE_ROW_CC_R5"/>
+            <w:bookmarkEnd w:id="40"/>
+          </w:p>
         </w:tc>
         <w:tc>
           <w:tcPr>
@@ -13195,7 +13278,10 @@
               <w:right w:val="single" w:sz="4" w:space="0" w:color="888888"/>
             </w:tcBorders>
           </w:tcPr>
-          <w:p/>
+          <w:p>
+            <w:bookmarkStart w:id="41" w:name="TASSURE_ROW_CC_R6"/>
+            <w:bookmarkEnd w:id="41"/>
+          </w:p>
         </w:tc>
         <w:tc>
           <w:tcPr>
@@ -13408,7 +13494,10 @@
               <w:right w:val="single" w:sz="4" w:space="0" w:color="888888"/>
             </w:tcBorders>
           </w:tcPr>
-          <w:p/>
+          <w:p>
+            <w:bookmarkStart w:id="42" w:name="TASSURE_ROW_CC_R7"/>
+            <w:bookmarkEnd w:id="42"/>
+          </w:p>
         </w:tc>
         <w:tc>
           <w:tcPr>
@@ -13631,9 +13720,11 @@
             </w:tcBorders>
           </w:tcPr>
           <w:p>
+            <w:bookmarkStart w:id="43" w:name="TASSURE_ROW_CC_R8"/>
             <w:pPr>
               <w:jc w:val="center"/>
             </w:pPr>
+            <w:bookmarkEnd w:id="43"/>
           </w:p>
         </w:tc>
         <w:tc>
@@ -13815,9 +13906,11 @@
             </w:tcBorders>
           </w:tcPr>
           <w:p>
+            <w:bookmarkStart w:id="44" w:name="TASSURE_ROW_CC_R9"/>
             <w:pPr>
               <w:jc w:val="center"/>
             </w:pPr>
+            <w:bookmarkEnd w:id="44"/>
           </w:p>
         </w:tc>
         <w:tc>
@@ -13999,9 +14092,11 @@
             </w:tcBorders>
           </w:tcPr>
           <w:p>
+            <w:bookmarkStart w:id="45" w:name="TASSURE_ROW_CC_R10"/>
             <w:pPr>
               <w:jc w:val="center"/>
             </w:pPr>
+            <w:bookmarkEnd w:id="45"/>
           </w:p>
         </w:tc>
         <w:tc>
@@ -14191,6 +14286,7 @@
             <w:vAlign w:val="center"/>
           </w:tcPr>
           <w:p>
+            <w:bookmarkStart w:id="46" w:name="TASSURE_ROW_CC_R11"/>
             <w:pPr>
               <w:jc w:val="center"/>
             </w:pPr>
@@ -14204,6 +14300,7 @@
               </w:rPr>
               <w:t>2</w:t>
             </w:r>
+            <w:bookmarkEnd w:id="46"/>
           </w:p>
         </w:tc>
         <w:tc>
@@ -14441,9 +14538,11 @@
             </w:tcBorders>
           </w:tcPr>
           <w:p>
+            <w:bookmarkStart w:id="47" w:name="TASSURE_ROW_CC_R12"/>
             <w:pPr>
               <w:jc w:val="center"/>
             </w:pPr>
+            <w:bookmarkEnd w:id="47"/>
           </w:p>
         </w:tc>
         <w:tc>
@@ -14625,9 +14724,11 @@
             </w:tcBorders>
           </w:tcPr>
           <w:p>
+            <w:bookmarkStart w:id="48" w:name="TASSURE_ROW_CC_R13"/>
             <w:pPr>
               <w:jc w:val="center"/>
             </w:pPr>
+            <w:bookmarkEnd w:id="48"/>
           </w:p>
         </w:tc>
         <w:tc>
@@ -14807,9 +14908,11 @@
             </w:tcBorders>
           </w:tcPr>
           <w:p>
+            <w:bookmarkStart w:id="49" w:name="TASSURE_ROW_CC_R14"/>
             <w:pPr>
               <w:jc w:val="center"/>
             </w:pPr>
+            <w:bookmarkEnd w:id="49"/>
           </w:p>
         </w:tc>
         <w:tc>
@@ -15011,9 +15114,11 @@
             </w:tcBorders>
           </w:tcPr>
           <w:p>
+            <w:bookmarkStart w:id="50" w:name="TASSURE_ROW_CC_R15"/>
             <w:pPr>
               <w:jc w:val="center"/>
             </w:pPr>
+            <w:bookmarkEnd w:id="50"/>
           </w:p>
         </w:tc>
         <w:tc>
@@ -15215,9 +15320,11 @@
             </w:tcBorders>
           </w:tcPr>
           <w:p>
+            <w:bookmarkStart w:id="51" w:name="TASSURE_ROW_CC_R16"/>
             <w:pPr>
               <w:jc w:val="center"/>
             </w:pPr>
+            <w:bookmarkEnd w:id="51"/>
           </w:p>
         </w:tc>
         <w:tc>
@@ -15452,6 +15559,7 @@
             <w:vAlign w:val="center"/>
           </w:tcPr>
           <w:p>
+            <w:bookmarkStart w:id="52" w:name="TASSURE_ROW_CC_R17"/>
             <w:pPr>
               <w:jc w:val="center"/>
             </w:pPr>
@@ -15465,6 +15573,7 @@
               </w:rPr>
               <w:t>3</w:t>
             </w:r>
+            <w:bookmarkEnd w:id="52"/>
           </w:p>
         </w:tc>
         <w:tc>
@@ -15696,9 +15805,11 @@
             </w:tcBorders>
           </w:tcPr>
           <w:p>
+            <w:bookmarkStart w:id="53" w:name="TASSURE_ROW_CC_R18"/>
             <w:pPr>
               <w:jc w:val="center"/>
             </w:pPr>
+            <w:bookmarkEnd w:id="53"/>
           </w:p>
         </w:tc>
         <w:tc>
@@ -15880,9 +15991,11 @@
             </w:tcBorders>
           </w:tcPr>
           <w:p>
+            <w:bookmarkStart w:id="54" w:name="TASSURE_ROW_CC_R19"/>
             <w:pPr>
               <w:jc w:val="center"/>
             </w:pPr>
+            <w:bookmarkEnd w:id="54"/>
           </w:p>
         </w:tc>
         <w:tc>
@@ -16071,6 +16184,7 @@
             <w:vAlign w:val="center"/>
           </w:tcPr>
           <w:p>
+            <w:bookmarkStart w:id="55" w:name="TASSURE_ROW_CC_R20"/>
             <w:pPr>
               <w:jc w:val="center"/>
             </w:pPr>
@@ -16084,6 +16198,7 @@
               </w:rPr>
               <w:t>4</w:t>
             </w:r>
+            <w:bookmarkEnd w:id="55"/>
           </w:p>
         </w:tc>
         <w:tc>
@@ -16321,6 +16436,7 @@
             <w:vAlign w:val="center"/>
           </w:tcPr>
           <w:p>
+            <w:bookmarkStart w:id="56" w:name="TASSURE_ROW_CC_R21"/>
             <w:pPr>
               <w:jc w:val="center"/>
             </w:pPr>
@@ -16334,6 +16450,7 @@
               </w:rPr>
               <w:t>5</w:t>
             </w:r>
+            <w:bookmarkEnd w:id="56"/>
           </w:p>
         </w:tc>
         <w:tc>
@@ -16604,6 +16721,7 @@
             <w:vAlign w:val="center"/>
           </w:tcPr>
           <w:p>
+            <w:bookmarkStart w:id="57" w:name="TASSURE_ROW_CC_R22"/>
             <w:pPr>
               <w:jc w:val="center"/>
               <w:rPr>
@@ -16622,6 +16740,7 @@
               </w:rPr>
               <w:t>6</w:t>
             </w:r>
+            <w:bookmarkEnd w:id="57"/>
           </w:p>
         </w:tc>
         <w:tc>
@@ -16839,9 +16958,11 @@
             </w:tcBorders>
           </w:tcPr>
           <w:p>
+            <w:bookmarkStart w:id="58" w:name="TASSURE_ROW_CC_R23"/>
             <w:pPr>
               <w:jc w:val="center"/>
             </w:pPr>
+            <w:bookmarkEnd w:id="58"/>
           </w:p>
         </w:tc>
         <w:tc>
@@ -17033,6 +17154,7 @@
             <w:vAlign w:val="center"/>
           </w:tcPr>
           <w:p>
+            <w:bookmarkStart w:id="59" w:name="TASSURE_ROW_CC_R24"/>
             <w:pPr>
               <w:jc w:val="center"/>
               <w:rPr>
@@ -17055,6 +17177,7 @@
               </w:rPr>
               <w:t>7</w:t>
             </w:r>
+            <w:bookmarkEnd w:id="59"/>
           </w:p>
         </w:tc>
         <w:tc>
@@ -17272,6 +17395,7 @@
             <w:vAlign w:val="center"/>
           </w:tcPr>
           <w:p>
+            <w:bookmarkStart w:id="60" w:name="TASSURE_ROW_CC_R25"/>
             <w:pPr>
               <w:jc w:val="center"/>
               <w:rPr>
@@ -17283,6 +17407,7 @@
                 <w:lang w:eastAsia="zh-CN"/>
               </w:rPr>
             </w:pPr>
+            <w:bookmarkEnd w:id="60"/>
           </w:p>
         </w:tc>
         <w:tc>
@@ -17470,6 +17595,7 @@
             <w:vAlign w:val="center"/>
           </w:tcPr>
           <w:p>
+            <w:bookmarkStart w:id="61" w:name="TASSURE_ROW_CC_R26"/>
             <w:pPr>
               <w:jc w:val="center"/>
               <w:rPr>
@@ -17492,6 +17618,7 @@
               </w:rPr>
               <w:t>8</w:t>
             </w:r>
+            <w:bookmarkEnd w:id="61"/>
           </w:p>
         </w:tc>
         <w:tc>
@@ -17728,6 +17855,7 @@
             <w:vAlign w:val="center"/>
           </w:tcPr>
           <w:p>
+            <w:bookmarkStart w:id="62" w:name="TASSURE_ROW_CC_R27"/>
             <w:pPr>
               <w:jc w:val="center"/>
               <w:rPr>
@@ -17750,6 +17878,7 @@
               </w:rPr>
               <w:t>9</w:t>
             </w:r>
+            <w:bookmarkEnd w:id="62"/>
           </w:p>
         </w:tc>
         <w:tc>
@@ -17980,9 +18109,11 @@
             </w:tcBorders>
           </w:tcPr>
           <w:p>
+            <w:bookmarkStart w:id="63" w:name="TASSURE_ROW_CC_R28"/>
             <w:pPr>
               <w:jc w:val="center"/>
             </w:pPr>
+            <w:bookmarkEnd w:id="63"/>
           </w:p>
         </w:tc>
         <w:tc>
@@ -18197,9 +18328,11 @@
             </w:tcBorders>
           </w:tcPr>
           <w:p>
+            <w:bookmarkStart w:id="64" w:name="TASSURE_ROW_CC_R29"/>
             <w:pPr>
               <w:jc w:val="center"/>
             </w:pPr>
+            <w:bookmarkEnd w:id="64"/>
           </w:p>
         </w:tc>
         <w:tc>
@@ -18390,9 +18523,11 @@
             </w:tcBorders>
           </w:tcPr>
           <w:p>
+            <w:bookmarkStart w:id="65" w:name="TASSURE_ROW_CC_R30"/>
             <w:pPr>
               <w:jc w:val="center"/>
             </w:pPr>
+            <w:bookmarkEnd w:id="65"/>
           </w:p>
         </w:tc>
         <w:tc>

</xml_diff>